<commit_message>
Document the mlw-storage integration: licenses (paramiko), release notes, User Guide, Valkey and role docs
Co-Authored-By: Claude Sonnet 5.5 <noreply@anthropic.com>
</commit_message>
<xml_diff>
--- a/doc/User-Guide_v1.6.0.docx
+++ b/doc/User-Guide_v1.6.0.docx
@@ -160,7 +160,7 @@
         </w:rPr>
         <w:t>1.3 Conventions</w:t>
         <w:tab/>
-        <w:t>4</w:t>
+        <w:t>5</w:t>
       </w:r>
     </w:p>
     <w:p>
@@ -637,6 +637,24 @@
           <w:tab w:pos="9360" w:val="right" w:leader="dot"/>
         </w:tabs>
         <w:spacing w:after="0"/>
+        <w:ind w:left="360"/>
+      </w:pPr>
+      <w:r>
+        <w:rPr>
+          <w:b w:val="0"/>
+          <w:sz w:val="19"/>
+        </w:rPr>
+        <w:t>5.9 Your own file storage</w:t>
+        <w:tab/>
+        <w:t>12</w:t>
+      </w:r>
+    </w:p>
+    <w:p>
+      <w:pPr>
+        <w:tabs>
+          <w:tab w:pos="9360" w:val="right" w:leader="dot"/>
+        </w:tabs>
+        <w:spacing w:after="0"/>
         <w:ind w:left="0"/>
       </w:pPr>
       <w:r>
@@ -646,7 +664,7 @@
         </w:rPr>
         <w:t>6. The XSheet Tab</w:t>
         <w:tab/>
-        <w:t>12</w:t>
+        <w:t>13</w:t>
       </w:r>
     </w:p>
     <w:p>
@@ -700,7 +718,7 @@
         </w:rPr>
         <w:t>6.3 Collapsing repeated rows</w:t>
         <w:tab/>
-        <w:t>14</w:t>
+        <w:t>15</w:t>
       </w:r>
     </w:p>
     <w:p>
@@ -718,7 +736,7 @@
         </w:rPr>
         <w:t>6.4 Moving around</w:t>
         <w:tab/>
-        <w:t>14</w:t>
+        <w:t>15</w:t>
       </w:r>
     </w:p>
     <w:p>
@@ -1231,6 +1249,24 @@
           <w:tab w:pos="9360" w:val="right" w:leader="dot"/>
         </w:tabs>
         <w:spacing w:after="0"/>
+        <w:ind w:left="360"/>
+      </w:pPr>
+      <w:r>
+        <w:rPr>
+          <w:b w:val="0"/>
+          <w:sz w:val="19"/>
+        </w:rPr>
+        <w:t>14.5 Your own file storage (mlw-storage)</w:t>
+        <w:tab/>
+        <w:t>35</w:t>
+      </w:r>
+    </w:p>
+    <w:p>
+      <w:pPr>
+        <w:tabs>
+          <w:tab w:pos="9360" w:val="right" w:leader="dot"/>
+        </w:tabs>
+        <w:spacing w:after="0"/>
         <w:ind w:left="0"/>
       </w:pPr>
       <w:r>
@@ -1276,7 +1312,7 @@
         </w:rPr>
         <w:t>Appendix B. Related Documents</w:t>
         <w:tab/>
-        <w:t>36</w:t>
+        <w:t>37</w:t>
       </w:r>
     </w:p>
     <w:p>
@@ -1405,6 +1441,21 @@
       </w:r>
       <w:r>
         <w:t>: the first time you log in, your record starts from the preferences of the browser you use. Unsaved drafts that were kept only in the old per-browser storage are not carried over, so save your work before the server is upgraded.</w:t>
+      </w:r>
+    </w:p>
+    <w:p>
+      <w:pPr>
+        <w:pStyle w:val="ListBullet"/>
+        <w:spacing w:after="60"/>
+      </w:pPr>
+      <w:r>
+        <w:rPr>
+          <w:b/>
+        </w:rPr>
+        <w:t>Your own file storage</w:t>
+      </w:r>
+      <w:r>
+        <w:t>: if your administrator has set up mlw-storage, File &gt; Open and File &gt; Save As work on your own folder on the storage server, not on the server's data folder. Profile shows where it is, and File &gt; Storage Location lets you choose the folder (sections 3.4 and 5.9).</w:t>
       </w:r>
     </w:p>
     <w:p>
@@ -2405,6 +2456,14 @@
         <w:rPr>
           <w:i w:val="0"/>
         </w:rPr>
+        <w:t>If your administrator has set up your own file storage (section 5.9), Profile also shows three lines: Storage, the storage server and its SFTP port; Storage folder, your private directory or the shared folder you chose; and Storage access, Read and write or Read-only, or the reason it is not available. They are read when you sign in, and a Storage Location button opens the folder chooser. The built-in account has no storage; Profile says so.</w:t>
+      </w:r>
+    </w:p>
+    <w:p>
+      <w:r>
+        <w:rPr>
+          <w:i w:val="0"/>
+        </w:rPr>
         <w:t>Logout signs out every tab of your browser. If the open document has unsaved changes (to its text or its sketch), Logout first asks whether to save them: Yes saves them and signs out; No signs out without them (they are lost, and the next sign-in reopens the document as it was last saved); Cancel keeps you signed in.</w:t>
       </w:r>
     </w:p>
@@ -2581,7 +2640,7 @@
               <w:rPr>
                 <w:sz w:val="19"/>
               </w:rPr>
-              <w:t>New, Open, Open Recent, Save, Save As, Close, Export (Export XDTS, Export OCA), Preferences.</w:t>
+              <w:t>New, Open, Open Recent, Save, Save As, Close, Export (Export XDTS, Export OCA), Storage Location (when storage is set up), Preferences.</w:t>
             </w:r>
           </w:p>
         </w:tc>
@@ -3181,7 +3240,7 @@
         <w:rPr>
           <w:i w:val="0"/>
         </w:rPr>
-        <w:t>File &gt; Open lists the files of the data folder, starting in the folder you last opened a file from. Click a file and press OK. If a sketch was saved beside the document (a .svg file of the same name), it is loaded too. File &gt; Open Recent lists your most recent files (5 by default; 1 to 20 in Preferences); hover over an entry for two seconds to see its full path. Clear Recent Files empties the list.</w:t>
+        <w:t>File &gt; Open lists the files of the data folder (or, if you have your own file storage, of your storage; section 5.9), starting in the folder you last opened a file from. Click a file and press OK. If a sketch was saved beside the document (a .svg file of the same name), it is loaded too. File &gt; Open Recent lists your most recent files (5 by default; 1 to 20 in Preferences); hover over an entry for two seconds to see its full path. Clear Recent Files empties the list.</w:t>
       </w:r>
     </w:p>
     <w:p>
@@ -3337,6 +3396,46 @@
           <w:i w:val="0"/>
         </w:rPr>
         <w:t>Your changes, including those made in the XSheet grid and in dialogs, and a new document you have not saved, are kept as a draft. If you reload the page, open a new tab, the server restarts or you are timed out, the document you were working on comes back with its unsaved changes. Each file keeps its own draft; reopening a file that has one asks whether to restore it. An unsaved sketch is kept in the draft too. Drafts are saved under your account, so you can carry on from another browser; and a draft is never shown to another user, even one using the same browser.</w:t>
+      </w:r>
+    </w:p>
+    <w:p>
+      <w:pPr>
+        <w:pStyle w:val="Heading2"/>
+      </w:pPr>
+      <w:r>
+        <w:t>5.9 Your own file storage</w:t>
+      </w:r>
+    </w:p>
+    <w:p>
+      <w:r>
+        <w:rPr>
+          <w:i w:val="0"/>
+        </w:rPr>
+        <w:t>Your administrator may have set up mlw-storage, a file server that keeps each person's files in a folder of their own. When it is set up and you have signed in with Keycloak, File &gt; Open and File &gt; Save As (and Save on a document that has no file yet) show your storage instead of the server's data folder. You use them as before: double-click a folder to enter it, choose a file and press Open, or type a name and press Save; New Folder makes a folder. The dialog remembers the last folder you used.</w:t>
+      </w:r>
+    </w:p>
+    <w:p>
+      <w:r>
+        <w:rPr>
+          <w:i w:val="0"/>
+        </w:rPr>
+        <w:t>A document opened from your storage is saved back to it by Save, and its sketch is saved beside it as a .svg file. It appears in Open Recent, and is restored as a draft or as the document you were last working on, like any other. Exports and reports are still written to the server's data folder.</w:t>
+      </w:r>
+    </w:p>
+    <w:p>
+      <w:r>
+        <w:rPr>
+          <w:i w:val="0"/>
+        </w:rPr>
+        <w:t>Profile shows which storage and folder you are using (section 3.4). File &gt; Storage Location (or the Storage Location button in Profile) lists the folders of the shared area: choose one and press Use this folder to make it yours, or press Use my private directory to go back to the directory that was made for you. The change takes effect at once.</w:t>
+      </w:r>
+    </w:p>
+    <w:p>
+      <w:r>
+        <w:rPr>
+          <w:i w:val="0"/>
+        </w:rPr>
+        <w:t>If the storage server cannot be reached, Open and Save As show an error and nothing is saved there; try again later, or tell your administrator. If you are told your session is no longer available (for example after the server restarted), log out and sign in again; the document you were working on is reopened. The built-in account has no storage and keeps using the data folder. Your storage needs the Keycloak role mlw-user; the Viewer and Reviewer limits of section 11 apply as usual.</w:t>
       </w:r>
     </w:p>
     <w:p>
@@ -8617,6 +8716,158 @@
                 <w:rFonts w:ascii="Courier New" w:hAnsi="Courier New"/>
                 <w:sz w:val="18"/>
               </w:rPr>
+              <w:t>MLW_STORAGE_URL</w:t>
+            </w:r>
+          </w:p>
+        </w:tc>
+        <w:tc>
+          <w:tcPr>
+            <w:tcW w:type="dxa" w:w="6048"/>
+          </w:tcPr>
+          <w:p>
+            <w:pPr>
+              <w:spacing w:after="40"/>
+            </w:pPr>
+            <w:r>
+              <w:rPr>
+                <w:sz w:val="19"/>
+              </w:rPr>
+              <w:t>The mlw-storage gateway (for example http://mlw-proxy:8000). Empty turns the file storage off.</w:t>
+            </w:r>
+          </w:p>
+        </w:tc>
+      </w:tr>
+      <w:tr>
+        <w:trPr>
+          <w:cantSplit/>
+        </w:trPr>
+        <w:tc>
+          <w:tcPr>
+            <w:tcW w:type="dxa" w:w="3312"/>
+          </w:tcPr>
+          <w:p>
+            <w:pPr>
+              <w:spacing w:after="40"/>
+            </w:pPr>
+            <w:r>
+              <w:rPr>
+                <w:rFonts w:ascii="Courier New" w:hAnsi="Courier New"/>
+                <w:sz w:val="18"/>
+              </w:rPr>
+              <w:t>MLW_STORAGE_SFTP_HOST, MLW_STORAGE_SFTP_PORT</w:t>
+            </w:r>
+          </w:p>
+        </w:tc>
+        <w:tc>
+          <w:tcPr>
+            <w:tcW w:type="dxa" w:w="6048"/>
+          </w:tcPr>
+          <w:p>
+            <w:pPr>
+              <w:spacing w:after="40"/>
+            </w:pPr>
+            <w:r>
+              <w:rPr>
+                <w:sz w:val="19"/>
+              </w:rPr>
+              <w:t>The SFTP server; default the gateway's host, port 2222.</w:t>
+            </w:r>
+          </w:p>
+        </w:tc>
+      </w:tr>
+      <w:tr>
+        <w:trPr>
+          <w:cantSplit/>
+        </w:trPr>
+        <w:tc>
+          <w:tcPr>
+            <w:tcW w:type="dxa" w:w="3312"/>
+          </w:tcPr>
+          <w:p>
+            <w:pPr>
+              <w:spacing w:after="40"/>
+            </w:pPr>
+            <w:r>
+              <w:rPr>
+                <w:rFonts w:ascii="Courier New" w:hAnsi="Courier New"/>
+                <w:sz w:val="18"/>
+              </w:rPr>
+              <w:t>MLW_STORAGE_REQUIRED_ROLE, MLW_STORAGE_READONLY_ROLE</w:t>
+            </w:r>
+          </w:p>
+        </w:tc>
+        <w:tc>
+          <w:tcPr>
+            <w:tcW w:type="dxa" w:w="6048"/>
+          </w:tcPr>
+          <w:p>
+            <w:pPr>
+              <w:spacing w:after="40"/>
+            </w:pPr>
+            <w:r>
+              <w:rPr>
+                <w:sz w:val="19"/>
+              </w:rPr>
+              <w:t>The Keycloak realm roles that allow the storage (default mlw-user) and limit it to reading.</w:t>
+            </w:r>
+          </w:p>
+        </w:tc>
+      </w:tr>
+      <w:tr>
+        <w:trPr>
+          <w:cantSplit/>
+        </w:trPr>
+        <w:tc>
+          <w:tcPr>
+            <w:tcW w:type="dxa" w:w="3312"/>
+          </w:tcPr>
+          <w:p>
+            <w:pPr>
+              <w:spacing w:after="40"/>
+            </w:pPr>
+            <w:r>
+              <w:rPr>
+                <w:rFonts w:ascii="Courier New" w:hAnsi="Courier New"/>
+                <w:sz w:val="18"/>
+              </w:rPr>
+              <w:t>MLW_STORAGE_HOST_KEY, MLW_STORAGE_TIMEOUT</w:t>
+            </w:r>
+          </w:p>
+        </w:tc>
+        <w:tc>
+          <w:tcPr>
+            <w:tcW w:type="dxa" w:w="6048"/>
+          </w:tcPr>
+          <w:p>
+            <w:pPr>
+              <w:spacing w:after="40"/>
+            </w:pPr>
+            <w:r>
+              <w:rPr>
+                <w:sz w:val="19"/>
+              </w:rPr>
+              <w:t>The SSH host key to require (otherwise the first one seen is remembered); seconds to wait (8).</w:t>
+            </w:r>
+          </w:p>
+        </w:tc>
+      </w:tr>
+      <w:tr>
+        <w:trPr>
+          <w:cantSplit/>
+        </w:trPr>
+        <w:tc>
+          <w:tcPr>
+            <w:tcW w:type="dxa" w:w="3312"/>
+          </w:tcPr>
+          <w:p>
+            <w:pPr>
+              <w:spacing w:after="40"/>
+            </w:pPr>
+            <w:r>
+              <w:rPr>
+                <w:rFonts w:ascii="Courier New" w:hAnsi="Courier New"/>
+                <w:sz w:val="18"/>
+              </w:rPr>
               <w:t>TZ</w:t>
             </w:r>
           </w:p>
@@ -8836,6 +9087,22 @@
           <w:i w:val="0"/>
         </w:rPr>
         <w:t>&lt;user&gt; is kc:&lt;realm&gt;:&lt;Keycloak user id&gt; for a Keycloak user, or local:&lt;name&gt; for the built-in account. To look, run valkey-cli --scan --pattern 'mlw:xsheet:*' in the valkey container. To reset a user, stop the app and delete their three keys. Back up the valkey-data volume to keep users' settings and drafts. If Valkey is off or unreachable, the app falls back to storing the same data per browser, and logs a warning. Run only one app server against a Valkey database.</w:t>
+      </w:r>
+    </w:p>
+    <w:p>
+      <w:pPr>
+        <w:pStyle w:val="Heading2"/>
+      </w:pPr>
+      <w:r>
+        <w:t>14.5 Your own file storage (mlw-storage)</w:t>
+      </w:r>
+    </w:p>
+    <w:p>
+      <w:r>
+        <w:rPr>
+          <w:i w:val="0"/>
+        </w:rPr>
+        <w:t>mlw-xsheet can open and save each Keycloak user's documents in their own folder on an mlw-storage server (SFTPGo with the mlw-proxy gateway). Set MLW_STORAGE_URL (and MLW_STORAGE_SFTP_HOST if the SFTP server has another name) in .env, make sure the app can reach the gateway on the network (the development file joins mlw-platform_default), and give each user the realm role mlw-user; tools/keycloak_setup.py --storage-role does that for the user it creates. The app keeps each user's Keycloak tokens in memory only, asks the gateway where the user's root is, and connects over SFTP with the user's Keycloak id and a fresh access token. Which folder is a user's is decided by the gateway, per user; the app stores only the folder the dialogs start in (storage_dir) in Valkey. Because the tokens are in memory, users must sign in again after the app restarts. The first SSH host key seen is remembered; pin it with MLW_STORAGE_HOST_KEY. paramiko, the SFTP library, is licensed under the LGPL-2.1 and is used unmodified.</w:t>
       </w:r>
     </w:p>
     <w:p>
@@ -9299,6 +9566,43 @@
                 <w:sz w:val="19"/>
               </w:rPr>
               <w:t>Drafts kept only in the old per-browser storage are not carried into the new per-user storage. Save your work before an upgrade.</w:t>
+            </w:r>
+          </w:p>
+        </w:tc>
+      </w:tr>
+      <w:tr>
+        <w:trPr>
+          <w:cantSplit/>
+        </w:trPr>
+        <w:tc>
+          <w:tcPr>
+            <w:tcW w:type="dxa" w:w="3312"/>
+          </w:tcPr>
+          <w:p>
+            <w:pPr>
+              <w:spacing w:after="40"/>
+            </w:pPr>
+            <w:r>
+              <w:rPr>
+                <w:sz w:val="19"/>
+              </w:rPr>
+              <w:t>Open or Save As shows an error about the storage</w:t>
+            </w:r>
+          </w:p>
+        </w:tc>
+        <w:tc>
+          <w:tcPr>
+            <w:tcW w:type="dxa" w:w="6048"/>
+          </w:tcPr>
+          <w:p>
+            <w:pPr>
+              <w:spacing w:after="40"/>
+            </w:pPr>
+            <w:r>
+              <w:rPr>
+                <w:sz w:val="19"/>
+              </w:rPr>
+              <w:t>The storage server cannot be reached, or your Keycloak session is no longer known to the app. Try again; if it says to, log out and in. Check that you have the role mlw-user. Only the built-in account uses the data folder.</w:t>
             </w:r>
           </w:p>
         </w:tc>

</xml_diff>

<commit_message>
Export XDTS, OCA, XSheet and report to the user's storage; OCA cel images from storage
Adds a shared export destination chooser, RemotePath.write_bytes, put_tree and
get_images, and a folder mode for the storage dialog. User Guide, release notes
and README updated.

Co-Authored-By: Claude Sonnet 5.5 <noreply@anthropic.com>
</commit_message>
<xml_diff>
--- a/doc/User-Guide_v1.6.0.docx
+++ b/doc/User-Guide_v1.6.0.docx
@@ -1186,7 +1186,7 @@
         </w:rPr>
         <w:t>14.1 Running it</w:t>
         <w:tab/>
-        <w:t>33</w:t>
+        <w:t>34</w:t>
       </w:r>
     </w:p>
     <w:p>
@@ -1240,7 +1240,7 @@
         </w:rPr>
         <w:t>14.4 Per-user storage in Valkey</w:t>
         <w:tab/>
-        <w:t>34</w:t>
+        <w:t>35</w:t>
       </w:r>
     </w:p>
     <w:p>
@@ -1276,7 +1276,7 @@
         </w:rPr>
         <w:t>15. Troubleshooting</w:t>
         <w:tab/>
-        <w:t>35</w:t>
+        <w:t>36</w:t>
       </w:r>
     </w:p>
     <w:p>
@@ -3379,7 +3379,7 @@
         <w:rPr>
           <w:i w:val="0"/>
         </w:rPr>
-        <w:t>Everything the application writes for you (saved documents, exports, PDFs, folders made with New Folder and your pop-up log) is created in the data folder and belongs to the same user and group as that folder.</w:t>
+        <w:t>Everything the application writes for you (saved documents, exports, PDFs, folders made with New Folder and your pop-up log) is created in the data folder and belongs to the same user and group as that folder. (A Keycloak user with file storage set up saves and exports to their own storage instead; section 5.9.)</w:t>
       </w:r>
     </w:p>
     <w:p>
@@ -3419,7 +3419,7 @@
         <w:rPr>
           <w:i w:val="0"/>
         </w:rPr>
-        <w:t>A document opened from your storage is saved back to it by Save, and its sketch is saved beside it as a .svg file. It appears in Open Recent, and is restored as a draft or as the document you were last working on, like any other. Exports and reports are still written to the server's data folder.</w:t>
+        <w:t>A document opened from your storage is saved back to it by Save, and its sketch is saved beside it as a .svg file. It appears in Open Recent, and is restored as a draft or as the document you were last working on, like any other. The exports (section 13) use the same storage dialogs and write to your storage too.</w:t>
       </w:r>
     </w:p>
     <w:p>
@@ -8230,6 +8230,14 @@
           <w:i w:val="0"/>
         </w:rPr>
         <w:t>In Export OCA, set the picture size (1920 by 1080 by default), choose labelled placeholder images or none, and optionally a folder of your real cel images (LAYER/CEL.png or CEL.png) to copy from. A second step chooses where to save. Replacing an existing OCA folder asks first. What OCA cannot hold is kept in its metadata.</w:t>
+      </w:r>
+    </w:p>
+    <w:p>
+      <w:r>
+        <w:rPr>
+          <w:i w:val="0"/>
+        </w:rPr>
+        <w:t>With your own file storage (section 5.9), all four exports ask where to save in the same storage browser as Save As, and report an error if the storage cannot be reached. Export OCA builds the NAME.oca folder and copies it to your storage, and its cel images folder is chosen in, and read from, your storage too (the .png files in it and one level of sub-folders). The built-in account exports to the data folder.</w:t>
       </w:r>
     </w:p>
     <w:p>

</xml_diff>

<commit_message>
Work on a shared removable drive from the Storage Location dialog
The dialog lists the drives mlw-storage shares with the user (GET
/mlw/v1/storage/drives); Use this drive keeps Open, Save As, the exports and the
cel images folder on it (per-user storage_drive setting). Profile lists the
drives; an unavailable drive is an error. README and Word documents updated.

Co-Authored-By: Claude Sonnet 5.5 <noreply@anthropic.com>
</commit_message>
<xml_diff>
--- a/doc/User-Guide_v1.6.0.docx
+++ b/doc/User-Guide_v1.6.0.docx
@@ -655,6 +655,24 @@
           <w:tab w:pos="9360" w:val="right" w:leader="dot"/>
         </w:tabs>
         <w:spacing w:after="0"/>
+        <w:ind w:left="360"/>
+      </w:pPr>
+      <w:r>
+        <w:rPr>
+          <w:b w:val="0"/>
+          <w:sz w:val="19"/>
+        </w:rPr>
+        <w:t>5.10 Removable drives</w:t>
+        <w:tab/>
+        <w:t>13</w:t>
+      </w:r>
+    </w:p>
+    <w:p>
+      <w:pPr>
+        <w:tabs>
+          <w:tab w:pos="9360" w:val="right" w:leader="dot"/>
+        </w:tabs>
+        <w:spacing w:after="0"/>
         <w:ind w:left="0"/>
       </w:pPr>
       <w:r>
@@ -682,7 +700,7 @@
         </w:rPr>
         <w:t>6.1 Reading the sheet</w:t>
         <w:tab/>
-        <w:t>13</w:t>
+        <w:t>14</w:t>
       </w:r>
     </w:p>
     <w:p>
@@ -700,7 +718,7 @@
         </w:rPr>
         <w:t>6.2 The classic style</w:t>
         <w:tab/>
-        <w:t>14</w:t>
+        <w:t>15</w:t>
       </w:r>
     </w:p>
     <w:p>
@@ -754,7 +772,7 @@
         </w:rPr>
         <w:t>6.5 Editing in the grid</w:t>
         <w:tab/>
-        <w:t>15</w:t>
+        <w:t>16</w:t>
       </w:r>
     </w:p>
     <w:p>
@@ -772,7 +790,7 @@
         </w:rPr>
         <w:t>6.6 Adding and deleting frames and layers</w:t>
         <w:tab/>
-        <w:t>18</w:t>
+        <w:t>19</w:t>
       </w:r>
     </w:p>
     <w:p>
@@ -790,7 +808,7 @@
         </w:rPr>
         <w:t>7. The XML Tab</w:t>
         <w:tab/>
-        <w:t>21</w:t>
+        <w:t>22</w:t>
       </w:r>
     </w:p>
     <w:p>
@@ -808,7 +826,7 @@
         </w:rPr>
         <w:t>7.1 The editor</w:t>
         <w:tab/>
-        <w:t>21</w:t>
+        <w:t>22</w:t>
       </w:r>
     </w:p>
     <w:p>
@@ -826,7 +844,7 @@
         </w:rPr>
         <w:t>7.2 Find and Replace</w:t>
         <w:tab/>
-        <w:t>22</w:t>
+        <w:t>23</w:t>
       </w:r>
     </w:p>
     <w:p>
@@ -844,7 +862,7 @@
         </w:rPr>
         <w:t>7.3 Format</w:t>
         <w:tab/>
-        <w:t>22</w:t>
+        <w:t>23</w:t>
       </w:r>
     </w:p>
     <w:p>
@@ -862,7 +880,7 @@
         </w:rPr>
         <w:t>7.4 Hiding the tab</w:t>
         <w:tab/>
-        <w:t>22</w:t>
+        <w:t>23</w:t>
       </w:r>
     </w:p>
     <w:p>
@@ -880,7 +898,7 @@
         </w:rPr>
         <w:t>8. Validation</w:t>
         <w:tab/>
-        <w:t>22</w:t>
+        <w:t>23</w:t>
       </w:r>
     </w:p>
     <w:p>
@@ -898,7 +916,7 @@
         </w:rPr>
         <w:t>9. The Sketchpad and the SVG Tab</w:t>
         <w:tab/>
-        <w:t>23</w:t>
+        <w:t>24</w:t>
       </w:r>
     </w:p>
     <w:p>
@@ -916,7 +934,7 @@
         </w:rPr>
         <w:t>9.1 Turning it on</w:t>
         <w:tab/>
-        <w:t>24</w:t>
+        <w:t>25</w:t>
       </w:r>
     </w:p>
     <w:p>
@@ -934,7 +952,7 @@
         </w:rPr>
         <w:t>9.2 The toolbar</w:t>
         <w:tab/>
-        <w:t>24</w:t>
+        <w:t>25</w:t>
       </w:r>
     </w:p>
     <w:p>
@@ -952,7 +970,7 @@
         </w:rPr>
         <w:t>9.3 Drawing shapes</w:t>
         <w:tab/>
-        <w:t>25</w:t>
+        <w:t>26</w:t>
       </w:r>
     </w:p>
     <w:p>
@@ -970,7 +988,7 @@
         </w:rPr>
         <w:t>9.4 Selecting and reshaping</w:t>
         <w:tab/>
-        <w:t>25</w:t>
+        <w:t>26</w:t>
       </w:r>
     </w:p>
     <w:p>
@@ -988,7 +1006,7 @@
         </w:rPr>
         <w:t>9.5 Selecting several shapes</w:t>
         <w:tab/>
-        <w:t>25</w:t>
+        <w:t>26</w:t>
       </w:r>
     </w:p>
     <w:p>
@@ -1006,7 +1024,7 @@
         </w:rPr>
         <w:t>9.6 Colour and brush</w:t>
         <w:tab/>
-        <w:t>27</w:t>
+        <w:t>28</w:t>
       </w:r>
     </w:p>
     <w:p>
@@ -1024,7 +1042,7 @@
         </w:rPr>
         <w:t>9.7 Saving the sketch</w:t>
         <w:tab/>
-        <w:t>27</w:t>
+        <w:t>28</w:t>
       </w:r>
     </w:p>
     <w:p>
@@ -1042,7 +1060,7 @@
         </w:rPr>
         <w:t>9.8 The SVG tab</w:t>
         <w:tab/>
-        <w:t>28</w:t>
+        <w:t>29</w:t>
       </w:r>
     </w:p>
     <w:p>
@@ -1060,7 +1078,7 @@
         </w:rPr>
         <w:t>10. Reviews</w:t>
         <w:tab/>
-        <w:t>28</w:t>
+        <w:t>29</w:t>
       </w:r>
     </w:p>
     <w:p>
@@ -1078,7 +1096,7 @@
         </w:rPr>
         <w:t>11. Roles: What You Can Do</w:t>
         <w:tab/>
-        <w:t>29</w:t>
+        <w:t>30</w:t>
       </w:r>
     </w:p>
     <w:p>
@@ -1096,7 +1114,7 @@
         </w:rPr>
         <w:t>12. Preferences</w:t>
         <w:tab/>
-        <w:t>30</w:t>
+        <w:t>31</w:t>
       </w:r>
     </w:p>
     <w:p>
@@ -1114,7 +1132,7 @@
         </w:rPr>
         <w:t>12.1 The pop-up log</w:t>
         <w:tab/>
-        <w:t>31</w:t>
+        <w:t>32</w:t>
       </w:r>
     </w:p>
     <w:p>
@@ -1132,7 +1150,7 @@
         </w:rPr>
         <w:t>12.2 About</w:t>
         <w:tab/>
-        <w:t>32</w:t>
+        <w:t>33</w:t>
       </w:r>
     </w:p>
     <w:p>
@@ -1150,7 +1168,7 @@
         </w:rPr>
         <w:t>13. Reports, Export and Conversion</w:t>
         <w:tab/>
-        <w:t>32</w:t>
+        <w:t>33</w:t>
       </w:r>
     </w:p>
     <w:p>
@@ -1168,7 +1186,7 @@
         </w:rPr>
         <w:t>14. For the Server Administrator</w:t>
         <w:tab/>
-        <w:t>33</w:t>
+        <w:t>34</w:t>
       </w:r>
     </w:p>
     <w:p>
@@ -1186,7 +1204,7 @@
         </w:rPr>
         <w:t>14.1 Running it</w:t>
         <w:tab/>
-        <w:t>34</w:t>
+        <w:t>35</w:t>
       </w:r>
     </w:p>
     <w:p>
@@ -1204,7 +1222,7 @@
         </w:rPr>
         <w:t>14.2 Keycloak and roles</w:t>
         <w:tab/>
-        <w:t>34</w:t>
+        <w:t>35</w:t>
       </w:r>
     </w:p>
     <w:p>
@@ -1222,7 +1240,7 @@
         </w:rPr>
         <w:t>14.3 Other settings</w:t>
         <w:tab/>
-        <w:t>34</w:t>
+        <w:t>35</w:t>
       </w:r>
     </w:p>
     <w:p>
@@ -1240,7 +1258,7 @@
         </w:rPr>
         <w:t>14.4 Per-user storage in Valkey</w:t>
         <w:tab/>
-        <w:t>35</w:t>
+        <w:t>36</w:t>
       </w:r>
     </w:p>
     <w:p>
@@ -1258,7 +1276,7 @@
         </w:rPr>
         <w:t>14.5 Your own file storage (mlw-storage)</w:t>
         <w:tab/>
-        <w:t>35</w:t>
+        <w:t>36</w:t>
       </w:r>
     </w:p>
     <w:p>
@@ -1276,7 +1294,7 @@
         </w:rPr>
         <w:t>15. Troubleshooting</w:t>
         <w:tab/>
-        <w:t>36</w:t>
+        <w:t>37</w:t>
       </w:r>
     </w:p>
     <w:p>
@@ -1294,7 +1312,7 @@
         </w:rPr>
         <w:t>Appendix A. Glossary</w:t>
         <w:tab/>
-        <w:t>36</w:t>
+        <w:t>38</w:t>
       </w:r>
     </w:p>
     <w:p>
@@ -1312,7 +1330,7 @@
         </w:rPr>
         <w:t>Appendix B. Related Documents</w:t>
         <w:tab/>
-        <w:t>37</w:t>
+        <w:t>38</w:t>
       </w:r>
     </w:p>
     <w:p>
@@ -2456,7 +2474,7 @@
         <w:rPr>
           <w:i w:val="0"/>
         </w:rPr>
-        <w:t>If your administrator has set up your own file storage (section 5.9), Profile also shows three lines: Storage, the storage server and its SFTP port; Storage folder, your private directory or the shared folder you chose; and Storage access, Read and write or Read-only, or the reason it is not available. They are read when you sign in, and a Storage Location button opens the folder chooser. The built-in account has no storage; Profile says so.</w:t>
+        <w:t>If your administrator has set up your own file storage (section 5.9), Profile also shows these lines (and, when drives are shared with you, a fourth and a fifth, described in section 5.10): Storage, the storage server and its SFTP port; Storage folder, your private directory or the shared folder you chose; and Storage access, Read and write or Read-only, or the reason it is not available. They are read when you sign in, and a Storage Location button opens the folder chooser. The built-in account has no storage; Profile says so.</w:t>
       </w:r>
     </w:p>
     <w:p>
@@ -3436,6 +3454,30 @@
           <w:i w:val="0"/>
         </w:rPr>
         <w:t>If the storage server cannot be reached, Open and Save As show an error and nothing is saved there; try again later, or tell your administrator. If you are told your session is no longer available (for example after the server restarted), log out and sign in again; the document you were working on is reopened. The built-in account has no storage and keeps using the data folder. Your storage needs the Keycloak role mlw-user; the Viewer and Reviewer limits of section 11 apply as usual.</w:t>
+      </w:r>
+    </w:p>
+    <w:p>
+      <w:pPr>
+        <w:pStyle w:val="Heading2"/>
+      </w:pPr>
+      <w:r>
+        <w:t>5.10 Removable drives</w:t>
+      </w:r>
+    </w:p>
+    <w:p>
+      <w:r>
+        <w:rPr>
+          <w:i w:val="0"/>
+        </w:rPr>
+        <w:t>Your administrator can share a USB stick or other removable drive with you (or with everyone who has a Keycloak role). It then appears inside your storage as a folder called drives, with one folder for each drive, and File &gt; Storage Location lists the drives shared with you, each marked Read and write or Read-only. Select one and press Use this drive: Open, Save As and the four exports then start on that drive and cannot go above it (there is no .. row at its top), so everything you open or save is on the drive. The Cel Images Folder chooser of Export OCA stays on it too. Press Use my storage to work on your own storage again; choosing a folder or your private directory in the same dialog also ends the work on the drive.</w:t>
+      </w:r>
+    </w:p>
+    <w:p>
+      <w:r>
+        <w:rPr>
+          <w:i w:val="0"/>
+        </w:rPr>
+        <w:t>Profile lists the drives shared with you and marks the one in use. The choice is saved with your other settings, so it is still there after you log in again. If the drive is unplugged, or the administrator has stopped sharing it, Open, Save As and the exports show an error and do not open; choose File &gt; Storage Location to pick another drive or to go back to your storage. A read-only drive warns you in the save dialogs, and saving on it is refused. Open Recent can still reopen a file that is not on the drive, and Save writes a document back to wherever it came from.</w:t>
       </w:r>
     </w:p>
     <w:p>
@@ -9574,6 +9616,43 @@
                 <w:sz w:val="19"/>
               </w:rPr>
               <w:t>Drafts kept only in the old per-browser storage are not carried into the new per-user storage. Save your work before an upgrade.</w:t>
+            </w:r>
+          </w:p>
+        </w:tc>
+      </w:tr>
+      <w:tr>
+        <w:trPr>
+          <w:cantSplit/>
+        </w:trPr>
+        <w:tc>
+          <w:tcPr>
+            <w:tcW w:type="dxa" w:w="3312"/>
+          </w:tcPr>
+          <w:p>
+            <w:pPr>
+              <w:spacing w:after="40"/>
+            </w:pPr>
+            <w:r>
+              <w:rPr>
+                <w:sz w:val="19"/>
+              </w:rPr>
+              <w:t>Open or Save As says the drive is not available</w:t>
+            </w:r>
+          </w:p>
+        </w:tc>
+        <w:tc>
+          <w:tcPr>
+            <w:tcW w:type="dxa" w:w="6048"/>
+          </w:tcPr>
+          <w:p>
+            <w:pPr>
+              <w:spacing w:after="40"/>
+            </w:pPr>
+            <w:r>
+              <w:rPr>
+                <w:sz w:val="19"/>
+              </w:rPr>
+              <w:t>The removable drive you chose is unplugged or no longer shared with you. Choose File &gt; Storage Location and press Use my storage, or pick another drive; ask your administrator to plug it in or share it again.</w:t>
             </w:r>
           </w:p>
         </w:tc>

</xml_diff>

<commit_message>
Document the file information dialog and the release package in the User Guide and release notes
Co-Authored-By: Claude Sonnet 5.5 <noreply@anthropic.com>
</commit_message>
<xml_diff>
--- a/doc/User-Guide_v1.6.0.docx
+++ b/doc/User-Guide_v1.6.0.docx
@@ -232,7 +232,7 @@
         </w:rPr>
         <w:t>2.3 A first look</w:t>
         <w:tab/>
-        <w:t>5</w:t>
+        <w:t>6</w:t>
       </w:r>
     </w:p>
     <w:p>
@@ -376,7 +376,7 @@
         </w:rPr>
         <w:t>3.5 Time-out</w:t>
         <w:tab/>
-        <w:t>8</w:t>
+        <w:t>9</w:t>
       </w:r>
     </w:p>
     <w:p>
@@ -520,7 +520,7 @@
         </w:rPr>
         <w:t>5.2 Open and Open Recent</w:t>
         <w:tab/>
-        <w:t>10</w:t>
+        <w:t>11</w:t>
       </w:r>
     </w:p>
     <w:p>
@@ -574,7 +574,7 @@
         </w:rPr>
         <w:t>5.5 The modified mark</w:t>
         <w:tab/>
-        <w:t>11</w:t>
+        <w:t>12</w:t>
       </w:r>
     </w:p>
     <w:p>
@@ -673,6 +673,24 @@
           <w:tab w:pos="9360" w:val="right" w:leader="dot"/>
         </w:tabs>
         <w:spacing w:after="0"/>
+        <w:ind w:left="360"/>
+      </w:pPr>
+      <w:r>
+        <w:rPr>
+          <w:b w:val="0"/>
+          <w:sz w:val="19"/>
+        </w:rPr>
+        <w:t>5.11 File information</w:t>
+        <w:tab/>
+        <w:t>13</w:t>
+      </w:r>
+    </w:p>
+    <w:p>
+      <w:pPr>
+        <w:tabs>
+          <w:tab w:pos="9360" w:val="right" w:leader="dot"/>
+        </w:tabs>
+        <w:spacing w:after="0"/>
         <w:ind w:left="0"/>
       </w:pPr>
       <w:r>
@@ -682,7 +700,7 @@
         </w:rPr>
         <w:t>6. The XSheet Tab</w:t>
         <w:tab/>
-        <w:t>13</w:t>
+        <w:t>14</w:t>
       </w:r>
     </w:p>
     <w:p>
@@ -754,7 +772,7 @@
         </w:rPr>
         <w:t>6.4 Moving around</w:t>
         <w:tab/>
-        <w:t>15</w:t>
+        <w:t>16</w:t>
       </w:r>
     </w:p>
     <w:p>
@@ -1473,7 +1491,37 @@
         <w:t>Your own file storage</w:t>
       </w:r>
       <w:r>
-        <w:t>: if your administrator has set up mlw-storage, File &gt; Open and File &gt; Save As work on your own folder on the storage server, not on the server's data folder. Profile shows where it is, and File &gt; Storage Location lets you choose the folder (sections 3.4 and 5.9).</w:t>
+        <w:t>: if your administrator has set up mlw-storage, File &gt; Open and File &gt; Save As work on your own folder on the storage server, not on the server's data folder. Profile shows where it is, and File &gt; Storage Location lets you choose the folder (sections 3.4 and 5.9). The exports use it too.</w:t>
+      </w:r>
+    </w:p>
+    <w:p>
+      <w:pPr>
+        <w:pStyle w:val="ListBullet"/>
+        <w:spacing w:after="60"/>
+      </w:pPr>
+      <w:r>
+        <w:rPr>
+          <w:b/>
+        </w:rPr>
+        <w:t>Removable drives</w:t>
+      </w:r>
+      <w:r>
+        <w:t>: a USB or other drive that your administrator shares with you can be chosen in File &gt; Storage Location, so that Open, Save As and the exports stay on it (section 5.10).</w:t>
+      </w:r>
+    </w:p>
+    <w:p>
+      <w:pPr>
+        <w:pStyle w:val="ListBullet"/>
+        <w:spacing w:after="60"/>
+      </w:pPr>
+      <w:r>
+        <w:rPr>
+          <w:b/>
+        </w:rPr>
+        <w:t>File information</w:t>
+      </w:r>
+      <w:r>
+        <w:t>: the file icon in the footer shows the size, last change and location of the open file and of its sketch (section 5.11).</w:t>
       </w:r>
     </w:p>
     <w:p>
@@ -2054,7 +2102,7 @@
               <w:rPr>
                 <w:sz w:val="19"/>
               </w:rPr>
-              <w:t>The open file name (with a * when it has unsaved changes), the validation result, and the schema in use.</w:t>
+              <w:t>A file icon (click it for information about the file), the open file name (with a * when it has unsaved changes), the validation result, and the schema in use.</w:t>
             </w:r>
           </w:p>
         </w:tc>
@@ -2899,7 +2947,7 @@
         <w:rPr>
           <w:i w:val="0"/>
         </w:rPr>
-        <w:t>The left of the footer shows the open file name. A * after it means unsaved changes. A new document you have not saved is shown as untitled.xml *. The middle shows the most recent validation result, and the right shows the schema in use ("auto-detect" until you choose one). Short messages (confirmations, warnings and errors) pop up at the bottom of the window; they are also kept in a log (section 12).</w:t>
+        <w:t>The left of the footer shows a file icon and the open file name (the icon is described in section 5.11). A * after it means unsaved changes. A new document you have not saved is shown as untitled.xml *. The middle shows the most recent validation result, and the right shows the schema in use ("auto-detect" until you choose one). Short messages (confirmations, warnings and errors) pop up at the bottom of the window; they are also kept in a log (section 12).</w:t>
       </w:r>
     </w:p>
     <w:p>
@@ -3478,6 +3526,22 @@
           <w:i w:val="0"/>
         </w:rPr>
         <w:t>Profile lists the drives shared with you and marks the one in use. The choice is saved with your other settings, so it is still there after you log in again. If the drive is unplugged, or the administrator has stopped sharing it, Open, Save As and the exports show an error and do not open; choose File &gt; Storage Location to pick another drive or to go back to your storage. A read-only drive warns you in the save dialogs, and saving on it is refused. Open Recent can still reopen a file that is not on the drive, and Save writes a document back to wherever it came from.</w:t>
+      </w:r>
+    </w:p>
+    <w:p>
+      <w:pPr>
+        <w:pStyle w:val="Heading2"/>
+      </w:pPr>
+      <w:r>
+        <w:t>5.11 File information</w:t>
+      </w:r>
+    </w:p>
+    <w:p>
+      <w:r>
+        <w:rPr>
+          <w:i w:val="0"/>
+        </w:rPr>
+        <w:t>Click the file icon at the left of the footer to see information about the open file. The File Information dialog has two parts. Document gives the file name, its folder, where it is (the server's data folder, your own storage or a removable drive), the full path, its size, when it was last changed and its permissions (and, for a file in the data folder, its owner), then the number of lines and characters in the editor, whether there are unsaved changes, and the schema in use. A document that has not been saved yet says so. Sketch (.svg) shows how many shapes the Sketchpad holds and whether they are unsaved, and the same details for the .svg file beside the document; if there is no such file it says that the sketch has not been saved yet. If the storage cannot be reached, the dialog says that for the file instead of failing. With no file open, the icon only reports that.</w:t>
       </w:r>
     </w:p>
     <w:p>
@@ -8406,6 +8470,14 @@
         <w:rPr>
           <w:i w:val="0"/>
         </w:rPr>
+        <w:t>For an installation on another machine, build a release package with scripts/package.sh &lt;version&gt;: a tar.gz holding the production image, the Valkey and Caddy images, the Compose files, these documents and an installer. On the target machine, which needs only Docker, unpack it and run ./install.sh --start --domain HOST (with --keycloak-url and --storage-url as needed). The installer verifies the files, loads the images and creates .env with a generated MLW_STORAGE_SECRET. Installation.md in the package describes the requirements, the settings, backups, upgrades and troubleshooting.</w:t>
+      </w:r>
+    </w:p>
+    <w:p>
+      <w:r>
+        <w:rPr>
+          <w:i w:val="0"/>
+        </w:rPr>
         <w:t>Production needs MLW_STORAGE_SECRET in .env. Documents live in the xsheet-data volume (/data); settings, drafts and the built-in credential in xsheet-state (/state).</w:t>
       </w:r>
     </w:p>
@@ -10410,7 +10482,45 @@
               <w:rPr>
                 <w:sz w:val="19"/>
               </w:rPr>
-              <w:t>What 1.6.0 added: per-user storage in Valkey.</w:t>
+              <w:t>What 1.6.0 added: per-user storage in Valkey, your own file storage and removable drives, file information, and the release package.</w:t>
+            </w:r>
+          </w:p>
+        </w:tc>
+      </w:tr>
+      <w:tr>
+        <w:trPr>
+          <w:cantSplit/>
+        </w:trPr>
+        <w:tc>
+          <w:tcPr>
+            <w:tcW w:type="dxa" w:w="4320"/>
+          </w:tcPr>
+          <w:p>
+            <w:pPr>
+              <w:spacing w:after="40"/>
+            </w:pPr>
+            <w:r>
+              <w:rPr>
+                <w:rFonts w:ascii="Courier New" w:hAnsi="Courier New"/>
+                <w:sz w:val="18"/>
+              </w:rPr>
+              <w:t>doc/Installation.md</w:t>
+            </w:r>
+          </w:p>
+        </w:tc>
+        <w:tc>
+          <w:tcPr>
+            <w:tcW w:type="dxa" w:w="5040"/>
+          </w:tcPr>
+          <w:p>
+            <w:pPr>
+              <w:spacing w:after="40"/>
+            </w:pPr>
+            <w:r>
+              <w:rPr>
+                <w:sz w:val="19"/>
+              </w:rPr>
+              <w:t>Installing from a release package: requirements, settings, backups, upgrades and troubleshooting.</w:t>
             </w:r>
           </w:p>
         </w:tc>

</xml_diff>